<commit_message>
Actualiza créditos con la malla curricular oficial con créditos
Aplica los créditos por asignatura de la malla oficial (7 a 9 en las
asignaturas de 160 horas y 4 a 5 en las de 80 horas, 60 por año) en los
puntos 4.3.5, 4.4 y 8, y ajusta el informe 4.5.

Co-Authored-By: Claude Opus 5.5 <noreply@anthropic.com>
Claude-Session: https://claude.ai/code/session_01Li7yxA95TVg4oPXuqG5DZe
</commit_message>
<xml_diff>
--- a/rediseno_2026/4.4 Estructura curricular.docx
+++ b/rediseno_2026/4.4 Estructura curricular.docx
@@ -3124,7 +3124,7 @@
                 <w:i w:val="0"/>
                 <w:sz w:val="18"/>
               </w:rPr>
-              <w:t>12</w:t>
+              <w:t>9</w:t>
             </w:r>
           </w:p>
         </w:tc>
@@ -3152,7 +3152,7 @@
                 <w:i w:val="0"/>
                 <w:sz w:val="18"/>
               </w:rPr>
-              <w:t>360</w:t>
+              <w:t>270</w:t>
             </w:r>
           </w:p>
         </w:tc>
@@ -3322,7 +3322,7 @@
                 <w:i w:val="0"/>
                 <w:sz w:val="18"/>
               </w:rPr>
-              <w:t>8</w:t>
+              <w:t>5</w:t>
             </w:r>
           </w:p>
         </w:tc>
@@ -3350,7 +3350,7 @@
                 <w:i w:val="0"/>
                 <w:sz w:val="18"/>
               </w:rPr>
-              <w:t>240</w:t>
+              <w:t>150</w:t>
             </w:r>
           </w:p>
         </w:tc>
@@ -3520,7 +3520,7 @@
                 <w:i w:val="0"/>
                 <w:sz w:val="18"/>
               </w:rPr>
-              <w:t>8</w:t>
+              <w:t>9</w:t>
             </w:r>
           </w:p>
         </w:tc>
@@ -3548,7 +3548,7 @@
                 <w:i w:val="0"/>
                 <w:sz w:val="18"/>
               </w:rPr>
-              <w:t>240</w:t>
+              <w:t>270</w:t>
             </w:r>
           </w:p>
         </w:tc>
@@ -3718,7 +3718,7 @@
                 <w:i w:val="0"/>
                 <w:sz w:val="18"/>
               </w:rPr>
-              <w:t>4</w:t>
+              <w:t>5</w:t>
             </w:r>
           </w:p>
         </w:tc>
@@ -3746,7 +3746,7 @@
                 <w:i w:val="0"/>
                 <w:sz w:val="18"/>
               </w:rPr>
-              <w:t>120</w:t>
+              <w:t>150</w:t>
             </w:r>
           </w:p>
         </w:tc>
@@ -3916,7 +3916,7 @@
                 <w:i w:val="0"/>
                 <w:sz w:val="18"/>
               </w:rPr>
-              <w:t>4</w:t>
+              <w:t>5</w:t>
             </w:r>
           </w:p>
         </w:tc>
@@ -3944,7 +3944,7 @@
                 <w:i w:val="0"/>
                 <w:sz w:val="18"/>
               </w:rPr>
-              <w:t>120</w:t>
+              <w:t>150</w:t>
             </w:r>
           </w:p>
         </w:tc>
@@ -4114,7 +4114,7 @@
                 <w:i w:val="0"/>
                 <w:sz w:val="18"/>
               </w:rPr>
-              <w:t>8</w:t>
+              <w:t>9</w:t>
             </w:r>
           </w:p>
         </w:tc>
@@ -4142,7 +4142,7 @@
                 <w:i w:val="0"/>
                 <w:sz w:val="18"/>
               </w:rPr>
-              <w:t>240</w:t>
+              <w:t>270</w:t>
             </w:r>
           </w:p>
         </w:tc>
@@ -4312,7 +4312,7 @@
                 <w:i w:val="0"/>
                 <w:sz w:val="18"/>
               </w:rPr>
-              <w:t>8</w:t>
+              <w:t>9</w:t>
             </w:r>
           </w:p>
         </w:tc>
@@ -4340,7 +4340,7 @@
                 <w:i w:val="0"/>
                 <w:sz w:val="18"/>
               </w:rPr>
-              <w:t>240</w:t>
+              <w:t>270</w:t>
             </w:r>
           </w:p>
         </w:tc>
@@ -4510,7 +4510,7 @@
                 <w:i w:val="0"/>
                 <w:sz w:val="18"/>
               </w:rPr>
-              <w:t>8</w:t>
+              <w:t>9</w:t>
             </w:r>
           </w:p>
         </w:tc>
@@ -4538,7 +4538,7 @@
                 <w:i w:val="0"/>
                 <w:sz w:val="18"/>
               </w:rPr>
-              <w:t>240</w:t>
+              <w:t>270</w:t>
             </w:r>
           </w:p>
         </w:tc>
@@ -7146,7 +7146,7 @@
                 <w:i w:val="0"/>
                 <w:sz w:val="18"/>
               </w:rPr>
-              <w:t>9</w:t>
+              <w:t>8</w:t>
             </w:r>
           </w:p>
         </w:tc>
@@ -7174,7 +7174,7 @@
                 <w:i w:val="0"/>
                 <w:sz w:val="18"/>
               </w:rPr>
-              <w:t>270</w:t>
+              <w:t>240</w:t>
             </w:r>
           </w:p>
         </w:tc>
@@ -7344,7 +7344,7 @@
                 <w:i w:val="0"/>
                 <w:sz w:val="18"/>
               </w:rPr>
-              <w:t>9</w:t>
+              <w:t>8</w:t>
             </w:r>
           </w:p>
         </w:tc>
@@ -7372,7 +7372,7 @@
                 <w:i w:val="0"/>
                 <w:sz w:val="18"/>
               </w:rPr>
-              <w:t>270</w:t>
+              <w:t>240</w:t>
             </w:r>
           </w:p>
         </w:tc>
@@ -7938,7 +7938,7 @@
                 <w:i w:val="0"/>
                 <w:sz w:val="18"/>
               </w:rPr>
-              <w:t>8</w:t>
+              <w:t>7</w:t>
             </w:r>
           </w:p>
         </w:tc>
@@ -7966,7 +7966,7 @@
                 <w:i w:val="0"/>
                 <w:sz w:val="18"/>
               </w:rPr>
-              <w:t>240</w:t>
+              <w:t>210</w:t>
             </w:r>
           </w:p>
         </w:tc>
@@ -8136,7 +8136,7 @@
                 <w:i w:val="0"/>
                 <w:sz w:val="18"/>
               </w:rPr>
-              <w:t>6</w:t>
+              <w:t>7</w:t>
             </w:r>
           </w:p>
         </w:tc>
@@ -8164,7 +8164,7 @@
                 <w:i w:val="0"/>
                 <w:sz w:val="18"/>
               </w:rPr>
-              <w:t>180</w:t>
+              <w:t>210</w:t>
             </w:r>
           </w:p>
         </w:tc>
@@ -8334,7 +8334,7 @@
                 <w:i w:val="0"/>
                 <w:sz w:val="18"/>
               </w:rPr>
-              <w:t>6</w:t>
+              <w:t>7</w:t>
             </w:r>
           </w:p>
         </w:tc>
@@ -8362,7 +8362,7 @@
                 <w:i w:val="0"/>
                 <w:sz w:val="18"/>
               </w:rPr>
-              <w:t>180</w:t>
+              <w:t>210</w:t>
             </w:r>
           </w:p>
         </w:tc>
@@ -8532,7 +8532,7 @@
                 <w:i w:val="0"/>
                 <w:sz w:val="18"/>
               </w:rPr>
-              <w:t>6</w:t>
+              <w:t>7</w:t>
             </w:r>
           </w:p>
         </w:tc>
@@ -8560,7 +8560,7 @@
                 <w:i w:val="0"/>
                 <w:sz w:val="18"/>
               </w:rPr>
-              <w:t>180</w:t>
+              <w:t>210</w:t>
             </w:r>
           </w:p>
         </w:tc>
@@ -9157,7 +9157,7 @@
                 <w:i w:val="0"/>
                 <w:sz w:val="18"/>
               </w:rPr>
-              <w:t>8</w:t>
+              <w:t>7</w:t>
             </w:r>
           </w:p>
         </w:tc>
@@ -9185,7 +9185,7 @@
                 <w:i w:val="0"/>
                 <w:sz w:val="18"/>
               </w:rPr>
-              <w:t>240</w:t>
+              <w:t>210</w:t>
             </w:r>
           </w:p>
         </w:tc>
@@ -9355,7 +9355,7 @@
                 <w:i w:val="0"/>
                 <w:sz w:val="18"/>
               </w:rPr>
-              <w:t>8</w:t>
+              <w:t>7</w:t>
             </w:r>
           </w:p>
         </w:tc>
@@ -9383,7 +9383,7 @@
                 <w:i w:val="0"/>
                 <w:sz w:val="18"/>
               </w:rPr>
-              <w:t>240</w:t>
+              <w:t>210</w:t>
             </w:r>
           </w:p>
         </w:tc>
@@ -9553,7 +9553,7 @@
                 <w:i w:val="0"/>
                 <w:sz w:val="18"/>
               </w:rPr>
-              <w:t>8</w:t>
+              <w:t>7</w:t>
             </w:r>
           </w:p>
         </w:tc>
@@ -9581,7 +9581,7 @@
                 <w:i w:val="0"/>
                 <w:sz w:val="18"/>
               </w:rPr>
-              <w:t>240</w:t>
+              <w:t>210</w:t>
             </w:r>
           </w:p>
         </w:tc>
@@ -9751,7 +9751,7 @@
                 <w:i w:val="0"/>
                 <w:sz w:val="18"/>
               </w:rPr>
-              <w:t>8</w:t>
+              <w:t>7</w:t>
             </w:r>
           </w:p>
         </w:tc>
@@ -9779,7 +9779,7 @@
                 <w:i w:val="0"/>
                 <w:sz w:val="18"/>
               </w:rPr>
-              <w:t>240</w:t>
+              <w:t>210</w:t>
             </w:r>
           </w:p>
         </w:tc>
@@ -10147,7 +10147,7 @@
                 <w:i w:val="0"/>
                 <w:sz w:val="18"/>
               </w:rPr>
-              <w:t>4</w:t>
+              <w:t>5</w:t>
             </w:r>
           </w:p>
         </w:tc>
@@ -10175,7 +10175,7 @@
                 <w:i w:val="0"/>
                 <w:sz w:val="18"/>
               </w:rPr>
-              <w:t>120</w:t>
+              <w:t>150</w:t>
             </w:r>
           </w:p>
         </w:tc>
@@ -10345,7 +10345,7 @@
                 <w:i w:val="0"/>
                 <w:sz w:val="18"/>
               </w:rPr>
-              <w:t>7</w:t>
+              <w:t>8</w:t>
             </w:r>
           </w:p>
         </w:tc>
@@ -10373,7 +10373,7 @@
                 <w:i w:val="0"/>
                 <w:sz w:val="18"/>
               </w:rPr>
-              <w:t>210</w:t>
+              <w:t>240</w:t>
             </w:r>
           </w:p>
         </w:tc>
@@ -10543,7 +10543,7 @@
                 <w:i w:val="0"/>
                 <w:sz w:val="18"/>
               </w:rPr>
-              <w:t>7</w:t>
+              <w:t>8</w:t>
             </w:r>
           </w:p>
         </w:tc>
@@ -10571,7 +10571,7 @@
                 <w:i w:val="0"/>
                 <w:sz w:val="18"/>
               </w:rPr>
-              <w:t>210</w:t>
+              <w:t>240</w:t>
             </w:r>
           </w:p>
         </w:tc>
@@ -10741,7 +10741,7 @@
                 <w:i w:val="0"/>
                 <w:sz w:val="18"/>
               </w:rPr>
-              <w:t>3</w:t>
+              <w:t>4</w:t>
             </w:r>
           </w:p>
         </w:tc>
@@ -10769,7 +10769,7 @@
                 <w:i w:val="0"/>
                 <w:sz w:val="18"/>
               </w:rPr>
-              <w:t>90</w:t>
+              <w:t>120</w:t>
             </w:r>
           </w:p>
         </w:tc>
@@ -15082,7 +15082,7 @@
           <w:i w:val="0"/>
           <w:sz w:val="20"/>
         </w:rPr>
-        <w:t>Cada año académico suma 60 créditos y 1.800 horas de trabajo, de modo que el plan totaliza 300 créditos y 9.000 horas de trabajo: 6.000 horas académicas presenciales y 3.000 horas no presenciales. Los créditos de cada asignatura no son proporcionales a sus horas presenciales, porque incorporan el trabajo no presencial que exige cada una. Por ejemplo, CPA-101 Contabilidad Básica tiene 160 horas presenciales y 12 créditos, que equivalen a 360 horas de trabajo, mientras que ADM-301 Desarrollo Organizacional y Comportamiento Organizacional tiene las mismas 160 horas presenciales y 6 créditos, que equivalen a 180 horas de trabajo. La distinción de horas teóricas, prácticas y de laboratorio se consigna en cada plan de asignatura, según el formato de cálculo de horas de la Universidad.</w:t>
+        <w:t>Cada año académico suma 60 créditos y 1.800 horas de trabajo, de modo que el plan totaliza 300 créditos y 9.000 horas de trabajo: 6.000 horas académicas presenciales y 3.000 horas no presenciales. Los créditos de cada asignatura no son proporcionales a sus horas presenciales, porque incorporan el trabajo no presencial que exige cada una. Por ejemplo, CPA-101 Contabilidad Básica tiene 160 horas presenciales y 9 créditos, que equivalen a 270 horas de trabajo, mientras que CPA-305 Sistemas Contables ERP y Análisis de Datos tiene las mismas 160 horas presenciales y 7 créditos, que equivalen a 210 horas de trabajo. La distinción de horas teóricas, prácticas y de laboratorio se consigna en cada plan de asignatura, según el formato de cálculo de horas de la Universidad.</w:t>
       </w:r>
     </w:p>
     <w:sectPr>

</xml_diff>